<commit_message>
Update education: Financial University 2018-2022, Bachelor of Economics, International Finance
</commit_message>
<xml_diff>
--- a/Resume/Resume_Vladislav_Orekhov_EN.docx
+++ b/Resume/Resume_Vladislav_Orekhov_EN.docx
@@ -696,29 +696,6 @@
           <w:b/>
           <w:sz w:val="21"/>
         </w:rPr>
-        <w:t>Touro College &amp; University, New York, NY</w:t>
-      </w:r>
-      <w:r>
-        <w:rPr>
-          <w:i/>
-          <w:color w:val="666666"/>
-          <w:sz w:val="19"/>
-        </w:rPr>
-        <w:br/>
-        <w:t>2021 – 2022</w:t>
-      </w:r>
-    </w:p>
-    <w:p>
-      <w:r>
-        <w:t>Bachelor of Science, Business Management</w:t>
-      </w:r>
-    </w:p>
-    <w:p>
-      <w:r>
-        <w:rPr>
-          <w:b/>
-          <w:sz w:val="21"/>
-        </w:rPr>
         <w:t>Financial University under the Government of the Russian Federation, Moscow</w:t>
       </w:r>
       <w:r>
@@ -728,7 +705,12 @@
           <w:sz w:val="19"/>
         </w:rPr>
         <w:br/>
-        <w:t>2018 – 2021</w:t>
+        <w:t>2018 – 2022</w:t>
+      </w:r>
+    </w:p>
+    <w:p>
+      <w:r>
+        <w:t>Bachelor of Economics, International Finance</w:t>
       </w:r>
     </w:p>
     <w:p>

</xml_diff>

<commit_message>
Make GitHub links clickable in resumes (Markdown + Word)
</commit_message>
<xml_diff>
--- a/Resume/Resume_Vladislav_Orekhov_EN.docx
+++ b/Resume/Resume_Vladislav_Orekhov_EN.docx
@@ -36,8 +36,19 @@
           <w:color w:val="555555"/>
           <w:sz w:val="18"/>
         </w:rPr>
-        <w:t>GitHub: github.com/vladislavmiller2000-bit</w:t>
+        <w:t xml:space="preserve">GitHub: </w:t>
       </w:r>
+      <w:hyperlink r:id="rId9">
+        <w:r>
+          <w:rPr>
+            <w:color w:val="1F497D"/>
+            <w:u w:val="single"/>
+            <w:sz w:val="18"/>
+            <w:szCs w:val="18"/>
+          </w:rPr>
+          <w:t>github.com/vladislavmiller2000-bit</w:t>
+        </w:r>
+      </w:hyperlink>
     </w:p>
     <w:p>
       <w:pPr>
@@ -287,13 +298,18 @@
         </w:rPr>
         <w:t xml:space="preserve">GitHub: </w:t>
       </w:r>
-      <w:r>
-        <w:rPr>
-          <w:b/>
-          <w:sz w:val="19"/>
-        </w:rPr>
-        <w:t>github.com/vladislavmiller2000-bit/System-Analysis</w:t>
-      </w:r>
+      <w:hyperlink r:id="rId10">
+        <w:r>
+          <w:rPr>
+            <w:color w:val="1F497D"/>
+            <w:u w:val="single"/>
+            <w:sz w:val="19"/>
+            <w:szCs w:val="19"/>
+            <w:b/>
+          </w:rPr>
+          <w:t>github.com/vladislavmiller2000-bit/System-Analysis</w:t>
+        </w:r>
+      </w:hyperlink>
     </w:p>
     <w:p>
       <w:r>

</xml_diff>

<commit_message>
All GitHub links now point to System-Analysis repository
</commit_message>
<xml_diff>
--- a/Resume/Resume_Vladislav_Orekhov_EN.docx
+++ b/Resume/Resume_Vladislav_Orekhov_EN.docx
@@ -46,7 +46,7 @@
             <w:sz w:val="18"/>
             <w:szCs w:val="18"/>
           </w:rPr>
-          <w:t>github.com/vladislavmiller2000-bit</w:t>
+          <w:t>github.com/vladislavmiller2000-bit/System-Analysis</w:t>
         </w:r>
       </w:hyperlink>
     </w:p>
@@ -298,7 +298,7 @@
         </w:rPr>
         <w:t xml:space="preserve">GitHub: </w:t>
       </w:r>
-      <w:hyperlink r:id="rId10">
+      <w:hyperlink r:id="rId9">
         <w:r>
           <w:rPr>
             <w:color w:val="1F497D"/>

</xml_diff>

<commit_message>
Enhance resumes: detailed projects (SAR), specific work experience (KFC, BK, Knight Frank), technical depth
</commit_message>
<xml_diff>
--- a/Resume/Resume_Vladislav_Orekhov_EN.docx
+++ b/Resume/Resume_Vladislav_Orekhov_EN.docx
@@ -9,8 +9,8 @@
       <w:r>
         <w:rPr>
           <w:b/>
-          <w:color w:val="1A1A1A"/>
-          <w:sz w:val="40"/>
+          <w:color w:val="1F497D"/>
+          <w:sz w:val="32"/>
         </w:rPr>
         <w:t>VLADISLAV OREKHOV</w:t>
       </w:r>
@@ -53,13 +53,13 @@
     <w:p>
       <w:pPr>
         <w:pBdr>
-          <w:bottom w:val="single" w:sz="4" w:color="1A4A7A" w:space="1"/>
+          <w:bottom w:val="single" w:sz="4" w:space="1" w:color="1F497D"/>
         </w:pBdr>
       </w:pPr>
       <w:r>
         <w:rPr>
           <w:b/>
-          <w:color w:val="1A4A7A"/>
+          <w:color w:val="1F497D"/>
           <w:sz w:val="22"/>
         </w:rPr>
         <w:t>OBJECTIVE</w:t>
@@ -69,7 +69,7 @@
       <w:r>
         <w:rPr>
           <w:b/>
-          <w:sz w:val="21"/>
+          <w:sz w:val="20"/>
         </w:rPr>
         <w:t>Junior System Analyst / Junior Business Analyst</w:t>
       </w:r>
@@ -82,13 +82,13 @@
     <w:p>
       <w:pPr>
         <w:pBdr>
-          <w:bottom w:val="single" w:sz="4" w:color="1A4A7A" w:space="1"/>
+          <w:bottom w:val="single" w:sz="4" w:space="1" w:color="1F497D"/>
         </w:pBdr>
       </w:pPr>
       <w:r>
         <w:rPr>
           <w:b/>
-          <w:color w:val="1A4A7A"/>
+          <w:color w:val="1F497D"/>
           <w:sz w:val="22"/>
         </w:rPr>
         <w:t>SUMMARY</w:t>
@@ -107,13 +107,13 @@
     <w:p>
       <w:pPr>
         <w:pBdr>
-          <w:bottom w:val="single" w:sz="4" w:color="1A4A7A" w:space="1"/>
+          <w:bottom w:val="single" w:sz="4" w:space="1" w:color="1F497D"/>
         </w:pBdr>
       </w:pPr>
       <w:r>
         <w:rPr>
           <w:b/>
-          <w:color w:val="1A4A7A"/>
+          <w:color w:val="1F497D"/>
           <w:sz w:val="22"/>
         </w:rPr>
         <w:t>KEY SKILLS</w:t>
@@ -122,7 +122,7 @@
     <w:tbl>
       <w:tblPr>
         <w:tblW w:type="auto" w:w="0"/>
-        <w:jc w:val="center"/>
+        <w:jc w:val="left"/>
         <w:tblLook w:firstColumn="1" w:firstRow="1" w:lastColumn="0" w:lastRow="0" w:noHBand="0" w:noVBand="1" w:val="04A0"/>
       </w:tblPr>
       <w:tblGrid>
@@ -138,7 +138,7 @@
             <w:r>
               <w:rPr>
                 <w:b/>
-                <w:sz w:val="19"/>
+                <w:sz w:val="18"/>
               </w:rPr>
               <w:t>Analysis &amp; Modeling</w:t>
             </w:r>
@@ -146,12 +146,12 @@
         </w:tc>
         <w:tc>
           <w:tcPr>
-            <w:tcW w:type="dxa" w:w="7370"/>
+            <w:tcW w:type="dxa" w:w="4986"/>
           </w:tcPr>
           <w:p>
             <w:r>
               <w:rPr>
-                <w:sz w:val="19"/>
+                <w:sz w:val="18"/>
               </w:rPr>
               <w:t>BPMN 2.0, UML (Use Case, State Machine, Activity), ERD (Chen, Crow's Foot)</w:t>
             </w:r>
@@ -167,7 +167,7 @@
             <w:r>
               <w:rPr>
                 <w:b/>
-                <w:sz w:val="19"/>
+                <w:sz w:val="18"/>
               </w:rPr>
               <w:t>Data &amp; SQL</w:t>
             </w:r>
@@ -175,12 +175,12 @@
         </w:tc>
         <w:tc>
           <w:tcPr>
-            <w:tcW w:type="dxa" w:w="7370"/>
+            <w:tcW w:type="dxa" w:w="4986"/>
           </w:tcPr>
           <w:p>
             <w:r>
               <w:rPr>
-                <w:sz w:val="19"/>
+                <w:sz w:val="18"/>
               </w:rPr>
               <w:t>SQL (JOIN, subqueries, CTEs, window functions, aggregation), normalization (1NF–3NF)</w:t>
             </w:r>
@@ -196,7 +196,7 @@
             <w:r>
               <w:rPr>
                 <w:b/>
-                <w:sz w:val="19"/>
+                <w:sz w:val="18"/>
               </w:rPr>
               <w:t>Tools</w:t>
             </w:r>
@@ -204,12 +204,12 @@
         </w:tc>
         <w:tc>
           <w:tcPr>
-            <w:tcW w:type="dxa" w:w="7370"/>
+            <w:tcW w:type="dxa" w:w="4986"/>
           </w:tcPr>
           <w:p>
             <w:r>
               <w:rPr>
-                <w:sz w:val="19"/>
+                <w:sz w:val="18"/>
               </w:rPr>
               <w:t>Power BI, MS Excel (pivot tables, formulas, charts), Miro, Draw.io, Figma</w:t>
             </w:r>
@@ -225,7 +225,7 @@
             <w:r>
               <w:rPr>
                 <w:b/>
-                <w:sz w:val="19"/>
+                <w:sz w:val="18"/>
               </w:rPr>
               <w:t>Documentation</w:t>
             </w:r>
@@ -233,12 +233,12 @@
         </w:tc>
         <w:tc>
           <w:tcPr>
-            <w:tcW w:type="dxa" w:w="7370"/>
+            <w:tcW w:type="dxa" w:w="4986"/>
           </w:tcPr>
           <w:p>
             <w:r>
               <w:rPr>
-                <w:sz w:val="19"/>
+                <w:sz w:val="18"/>
               </w:rPr>
               <w:t>Requirements gathering &amp; documentation, SRS, data dictionary, Use Case specifications</w:t>
             </w:r>
@@ -254,7 +254,7 @@
             <w:r>
               <w:rPr>
                 <w:b/>
-                <w:sz w:val="19"/>
+                <w:sz w:val="18"/>
               </w:rPr>
               <w:t>Methodologies</w:t>
             </w:r>
@@ -262,12 +262,12 @@
         </w:tc>
         <w:tc>
           <w:tcPr>
-            <w:tcW w:type="dxa" w:w="7370"/>
+            <w:tcW w:type="dxa" w:w="4986"/>
           </w:tcPr>
           <w:p>
             <w:r>
               <w:rPr>
-                <w:sz w:val="19"/>
+                <w:sz w:val="18"/>
               </w:rPr>
               <w:t>Agile/Scrum (fundamentals), Waterfall, AS-IS/TO-BE analysis</w:t>
             </w:r>
@@ -278,13 +278,13 @@
     <w:p>
       <w:pPr>
         <w:pBdr>
-          <w:bottom w:val="single" w:sz="4" w:color="1A4A7A" w:space="1"/>
+          <w:bottom w:val="single" w:sz="4" w:space="1" w:color="1F497D"/>
         </w:pBdr>
       </w:pPr>
       <w:r>
         <w:rPr>
           <w:b/>
-          <w:color w:val="1A4A7A"/>
+          <w:color w:val="1F497D"/>
           <w:sz w:val="22"/>
         </w:rPr>
         <w:t>PROJECTS &amp; PORTFOLIO</w:t>
@@ -315,7 +315,7 @@
       <w:r>
         <w:rPr>
           <w:b/>
-          <w:sz w:val="21"/>
+          <w:sz w:val="20"/>
         </w:rPr>
         <w:t>Vita Clinic — Medical Clinic Business Process Analysis</w:t>
       </w:r>
@@ -323,35 +323,35 @@
     <w:p>
       <w:pPr>
         <w:pStyle w:val="ListBullet"/>
-        <w:ind w:left="454"/>
+        <w:ind w:left="283"/>
       </w:pPr>
       <w:r>
         <w:rPr>
-          <w:sz w:val="20"/>
+          <w:sz w:val="19"/>
         </w:rPr>
-        <w:t>Conducted AS-IS analysis of patient appointment workflow, identified 4 bottlenecks</w:t>
+        <w:t>Conducted AS-IS analysis of patient appointment workflow, identified 4 bottlenecks (data duplication, manual routing, missing validation, receptionist dependency) and proposed solutions based on automation best practices</w:t>
       </w:r>
     </w:p>
     <w:p>
       <w:pPr>
         <w:pStyle w:val="ListBullet"/>
-        <w:ind w:left="454"/>
+        <w:ind w:left="283"/>
       </w:pPr>
       <w:r>
         <w:rPr>
-          <w:sz w:val="20"/>
+          <w:sz w:val="19"/>
         </w:rPr>
-        <w:t>Designed TO-BE model with automated scheduling — eliminated manual receptionist step</w:t>
+        <w:t>Designed TO-BE model with automated scheduling — reduced processing chain from 5 to 2 steps by eliminating manual receptionist stage and accelerating initial data processing</w:t>
       </w:r>
     </w:p>
     <w:p>
       <w:pPr>
         <w:pStyle w:val="ListBullet"/>
-        <w:ind w:left="454"/>
+        <w:ind w:left="283"/>
       </w:pPr>
       <w:r>
         <w:rPr>
-          <w:sz w:val="20"/>
+          <w:sz w:val="19"/>
         </w:rPr>
         <w:t>Created BPMN 2.0 diagrams (AS-IS and TO-BE) and UML State Machine for appointment lifecycle</w:t>
       </w:r>
@@ -359,32 +359,32 @@
     <w:p>
       <w:pPr>
         <w:pStyle w:val="ListBullet"/>
-        <w:ind w:left="454"/>
+        <w:ind w:left="283"/>
       </w:pPr>
       <w:r>
         <w:rPr>
-          <w:sz w:val="20"/>
+          <w:sz w:val="19"/>
         </w:rPr>
-        <w:t>Designed UI/UX: 12 wireframes for the mobile app in Figma</w:t>
+        <w:t>Built interactive mobile app prototype (12 screens) in Figma, designed user journey from authorization to appointment confirmation</w:t>
       </w:r>
     </w:p>
     <w:p>
       <w:pPr>
         <w:pStyle w:val="ListBullet"/>
-        <w:ind w:left="454"/>
+        <w:ind w:left="283"/>
       </w:pPr>
       <w:r>
         <w:rPr>
-          <w:sz w:val="20"/>
+          <w:sz w:val="19"/>
         </w:rPr>
-        <w:t>Defined 17 functional requirements for the information system</w:t>
+        <w:t>Defined 17 functional and 4 non-functional requirements, documented Use Case specification</w:t>
       </w:r>
     </w:p>
     <w:p>
       <w:r>
         <w:rPr>
           <w:b/>
-          <w:sz w:val="21"/>
+          <w:sz w:val="20"/>
         </w:rPr>
         <w:t>Nakarabine — E-Commerce Database Design</w:t>
       </w:r>
@@ -392,23 +392,23 @@
     <w:p>
       <w:pPr>
         <w:pStyle w:val="ListBullet"/>
-        <w:ind w:left="454"/>
+        <w:ind w:left="283"/>
       </w:pPr>
       <w:r>
         <w:rPr>
-          <w:sz w:val="20"/>
+          <w:sz w:val="19"/>
         </w:rPr>
-        <w:t>Designed logical data model: 5 tables with relationships and integrity constraints</w:t>
+        <w:t>Designed logical data model (PK, FK, UNIQUE, NOT NULL, CHECK constraints), defined relationship cardinalities and ensured referential integrity</w:t>
       </w:r>
     </w:p>
     <w:p>
       <w:pPr>
         <w:pStyle w:val="ListBullet"/>
-        <w:ind w:left="454"/>
+        <w:ind w:left="283"/>
       </w:pPr>
       <w:r>
         <w:rPr>
-          <w:sz w:val="20"/>
+          <w:sz w:val="19"/>
         </w:rPr>
         <w:t>Built ERD diagrams in Chen and Crow's Foot notations, performed normalization (1NF through 3NF)</w:t>
       </w:r>
@@ -416,20 +416,20 @@
     <w:p>
       <w:pPr>
         <w:pStyle w:val="ListBullet"/>
-        <w:ind w:left="454"/>
+        <w:ind w:left="283"/>
       </w:pPr>
       <w:r>
         <w:rPr>
-          <w:sz w:val="20"/>
+          <w:sz w:val="19"/>
         </w:rPr>
-        <w:t>Compiled comprehensive data dictionary with attribute descriptions, types, and constraints</w:t>
+        <w:t>Developed data dictionary and terminology glossary for team alignment: attribute descriptions, data types, business rules, allowed values</w:t>
       </w:r>
     </w:p>
     <w:p>
       <w:r>
         <w:rPr>
           <w:b/>
-          <w:sz w:val="21"/>
+          <w:sz w:val="20"/>
         </w:rPr>
         <w:t>Restaurant Sales Analysis — SQL Project</w:t>
       </w:r>
@@ -437,23 +437,23 @@
     <w:p>
       <w:pPr>
         <w:pStyle w:val="ListBullet"/>
-        <w:ind w:left="454"/>
+        <w:ind w:left="283"/>
       </w:pPr>
       <w:r>
         <w:rPr>
-          <w:sz w:val="20"/>
+          <w:sz w:val="19"/>
         </w:rPr>
-        <w:t>Designed relational schema with 3 tables (orders, menu items, order line items)</w:t>
+        <w:t>Designed relational schema (DDL: CREATE TABLE, PRIMARY KEY, FOREIGN KEY, constraints) and populated with test data (50 orders, 20 menu items)</w:t>
       </w:r>
     </w:p>
     <w:p>
       <w:pPr>
         <w:pStyle w:val="ListBullet"/>
-        <w:ind w:left="454"/>
+        <w:ind w:left="283"/>
       </w:pPr>
       <w:r>
         <w:rPr>
-          <w:sz w:val="20"/>
+          <w:sz w:val="19"/>
         </w:rPr>
         <w:t>Wrote 20+ analytical queries: revenue by period, profit margins, menu ABC analysis</w:t>
       </w:r>
@@ -461,11 +461,11 @@
     <w:p>
       <w:pPr>
         <w:pStyle w:val="ListBullet"/>
-        <w:ind w:left="454"/>
+        <w:ind w:left="283"/>
       </w:pPr>
       <w:r>
         <w:rPr>
-          <w:sz w:val="20"/>
+          <w:sz w:val="19"/>
         </w:rPr>
         <w:t>Applied JOIN, CTEs, window functions (LAG, RANK, ROW_NUMBER), subqueries, CASE expressions</w:t>
       </w:r>
@@ -473,13 +473,13 @@
     <w:p>
       <w:pPr>
         <w:pBdr>
-          <w:bottom w:val="single" w:sz="4" w:color="1A4A7A" w:space="1"/>
+          <w:bottom w:val="single" w:sz="4" w:space="1" w:color="1F497D"/>
         </w:pBdr>
       </w:pPr>
       <w:r>
         <w:rPr>
           <w:b/>
-          <w:color w:val="1A4A7A"/>
+          <w:color w:val="1F497D"/>
           <w:sz w:val="22"/>
         </w:rPr>
         <w:t>WORK EXPERIENCE</w:t>
@@ -489,15 +489,15 @@
       <w:r>
         <w:rPr>
           <w:b/>
-          <w:sz w:val="21"/>
+          <w:sz w:val="20"/>
         </w:rPr>
         <w:t>KFC Cinema City — Rishon LeTsiyon, Israel</w:t>
       </w:r>
       <w:r>
         <w:rPr>
           <w:i/>
-          <w:color w:val="666666"/>
-          <w:sz w:val="19"/>
+          <w:color w:val="555555"/>
+          <w:sz w:val="18"/>
         </w:rPr>
         <w:br/>
         <w:t>Deputy Director | April 2024 – April 2025</w:t>
@@ -506,74 +506,81 @@
     <w:p>
       <w:pPr>
         <w:pStyle w:val="ListBullet"/>
-        <w:ind w:left="454"/>
+        <w:ind w:left="283"/>
       </w:pPr>
       <w:r>
         <w:rPr>
-          <w:sz w:val="20"/>
+          <w:sz w:val="19"/>
         </w:rPr>
-        <w:t>Analyzed restaurant performance metrics (900+ daily receipts): revenue, capacity, production KPIs — identified bottlenecks, contributing to 10% quarterly profit increase</w:t>
+        <w:t>Built daily analytics system for the restaurant (900+ receipts/day): tracked revenue, average check, hourly load, output — identified lunch-peak underperformance, reallocated resources, contributing to 10% profit increase</w:t>
       </w:r>
     </w:p>
     <w:p>
       <w:pPr>
         <w:pStyle w:val="ListBullet"/>
-        <w:ind w:left="454"/>
+        <w:ind w:left="283"/>
       </w:pPr>
       <w:r>
         <w:rPr>
-          <w:sz w:val="20"/>
+          <w:sz w:val="19"/>
         </w:rPr>
-        <w:t>Optimized inventory management using data-driven approach, reducing supply costs by 15%</w:t>
+        <w:t>Implemented data-driven inventory management: analyzed consumption by category, adjusted procurement volumes — reduced supply costs by 15%</w:t>
       </w:r>
     </w:p>
     <w:p>
       <w:pPr>
         <w:pStyle w:val="ListBullet"/>
-        <w:ind w:left="454"/>
+        <w:ind w:left="283"/>
       </w:pPr>
       <w:r>
         <w:rPr>
-          <w:sz w:val="20"/>
+          <w:sz w:val="19"/>
         </w:rPr>
-        <w:t>Coordinated a team of 20+ employees, established operational processes</w:t>
+        <w:t>Coordinated a team of 20+ employees, standardized operational procedures and developed quality control checklists</w:t>
       </w:r>
     </w:p>
     <w:p>
       <w:r>
         <w:rPr>
+          <w:b/>
+          <w:sz w:val="20"/>
+        </w:rPr>
+      </w:r>
+      <w:r>
+        <w:rPr>
           <w:i/>
-          <w:color w:val="666666"/>
-          <w:sz w:val="19"/>
+          <w:color w:val="555555"/>
+          <w:sz w:val="18"/>
         </w:rPr>
+        <w:br/>
         <w:t>Shift Manager | November 2023 – April 2024</w:t>
       </w:r>
     </w:p>
     <w:p>
       <w:pPr>
         <w:pStyle w:val="ListBullet"/>
-        <w:ind w:left="454"/>
+        <w:ind w:left="283"/>
       </w:pPr>
       <w:r>
         <w:rPr>
-          <w:sz w:val="20"/>
+          <w:sz w:val="19"/>
         </w:rPr>
-        <w:t>Managed operational processes and quality control during shifts</w:t>
+        <w:t>Managed shift operations (15 employees): SLA control for service speed, quality metrics monitoring, real-time incident resolution</w:t>
       </w:r>
     </w:p>
     <w:p>
       <w:r>
         <w:rPr>
           <w:b/>
-          <w:sz w:val="21"/>
+          <w:sz w:val="20"/>
         </w:rPr>
         <w:t>Intern — Burger King Corporation, Moscow</w:t>
       </w:r>
       <w:r>
         <w:rPr>
           <w:i/>
-          <w:color w:val="666666"/>
-          <w:sz w:val="19"/>
+          <w:color w:val="555555"/>
+          <w:sz w:val="18"/>
         </w:rPr>
         <w:br/>
         <w:t>Marketing Research Department | Summer 2022</w:t>
@@ -582,86 +589,93 @@
     <w:p>
       <w:pPr>
         <w:pStyle w:val="ListBullet"/>
-        <w:ind w:left="454"/>
+        <w:ind w:left="283"/>
       </w:pPr>
       <w:r>
         <w:rPr>
-          <w:sz w:val="20"/>
+          <w:sz w:val="19"/>
         </w:rPr>
-        <w:t>Built sales analytics reports using Excel (pivot tables, formulas, ranking logic)</w:t>
+        <w:t>Built sales analytics dashboards for 50+ restaurants in Excel (pivot tables, INDEX/MATCH, conditional formatting)</w:t>
       </w:r>
     </w:p>
     <w:p>
       <w:pPr>
         <w:pStyle w:val="ListBullet"/>
-        <w:ind w:left="454"/>
+        <w:ind w:left="283"/>
       </w:pPr>
       <w:r>
         <w:rPr>
-          <w:sz w:val="20"/>
+          <w:sz w:val="19"/>
         </w:rPr>
-        <w:t>Automated receipt categorization and created restaurant revenue rankings — identified growth opportunities</w:t>
+        <w:t>Automated categorization of 10,000+ receipts and compiled restaurant revenue rankings — identified 5 growth opportunities for regional managers</w:t>
       </w:r>
     </w:p>
     <w:p>
       <w:pPr>
         <w:pStyle w:val="ListBullet"/>
-        <w:ind w:left="454"/>
+        <w:ind w:left="283"/>
       </w:pPr>
       <w:r>
         <w:rPr>
-          <w:sz w:val="20"/>
+          <w:sz w:val="19"/>
         </w:rPr>
-        <w:t>Prepared KPI visualizations for management presentations</w:t>
+        <w:t>Prepared KPI visualizations (conversion, average check, trends) for weekly management presentations</w:t>
       </w:r>
     </w:p>
     <w:p>
       <w:r>
         <w:rPr>
+          <w:b/>
+          <w:sz w:val="20"/>
+        </w:rPr>
+      </w:r>
+      <w:r>
+        <w:rPr>
           <w:i/>
-          <w:color w:val="666666"/>
-          <w:sz w:val="19"/>
+          <w:color w:val="555555"/>
+          <w:sz w:val="18"/>
         </w:rPr>
+        <w:br/>
         <w:t>Business Analytics Department | Summer 2019</w:t>
       </w:r>
     </w:p>
     <w:p>
       <w:pPr>
         <w:pStyle w:val="ListBullet"/>
-        <w:ind w:left="454"/>
+        <w:ind w:left="283"/>
       </w:pPr>
       <w:r>
         <w:rPr>
-          <w:sz w:val="20"/>
+          <w:sz w:val="19"/>
         </w:rPr>
-        <w:t>Collected and structured data for financial and operational analysis</w:t>
+        <w:t>Collected and structured financial data from multiple sources, prepared pivot tables for quarterly reports</w:t>
       </w:r>
     </w:p>
     <w:p>
       <w:pPr>
         <w:pStyle w:val="ListBullet"/>
-        <w:ind w:left="454"/>
+        <w:ind w:left="283"/>
       </w:pPr>
       <w:r>
         <w:rPr>
-          <w:sz w:val="20"/>
+          <w:sz w:val="19"/>
         </w:rPr>
-        <w:t>Prepared analytical materials and reports; gained experience in forecasting</w:t>
+        <w:t>Assisted in building sales forecast models based on historical data</w:t>
       </w:r>
     </w:p>
     <w:p>
       <w:r>
         <w:rPr>
           <w:b/>
-          <w:sz w:val="21"/>
+          <w:sz w:val="20"/>
         </w:rPr>
         <w:t>Intern — Knight Frank, Moscow</w:t>
       </w:r>
       <w:r>
         <w:rPr>
           <w:i/>
-          <w:color w:val="666666"/>
-          <w:sz w:val="19"/>
+          <w:color w:val="555555"/>
+          <w:sz w:val="18"/>
         </w:rPr>
         <w:br/>
         <w:t>Residential Real Estate Marketing Department | Spring 2022</w:t>
@@ -670,37 +684,37 @@
     <w:p>
       <w:pPr>
         <w:pStyle w:val="ListBullet"/>
-        <w:ind w:left="454"/>
+        <w:ind w:left="283"/>
       </w:pPr>
       <w:r>
         <w:rPr>
-          <w:sz w:val="20"/>
+          <w:sz w:val="19"/>
         </w:rPr>
-        <w:t>Conducted residential real estate market analysis and competitor benchmarking</w:t>
+        <w:t>Conducted competitive analysis of 30+ premium residential properties: price per m², location, infrastructure — prepared comparative report for investment decision-making</w:t>
       </w:r>
     </w:p>
     <w:p>
       <w:pPr>
         <w:pStyle w:val="ListBullet"/>
-        <w:ind w:left="454"/>
+        <w:ind w:left="283"/>
       </w:pPr>
       <w:r>
         <w:rPr>
-          <w:sz w:val="20"/>
+          <w:sz w:val="19"/>
         </w:rPr>
-        <w:t>Participated in property valuation, prepared reports for the international office</w:t>
+        <w:t>Participated in property valuation using comparative approach, prepared analytical briefs for the international office</w:t>
       </w:r>
     </w:p>
     <w:p>
       <w:pPr>
         <w:pBdr>
-          <w:bottom w:val="single" w:sz="4" w:color="1A4A7A" w:space="1"/>
+          <w:bottom w:val="single" w:sz="4" w:space="1" w:color="1F497D"/>
         </w:pBdr>
       </w:pPr>
       <w:r>
         <w:rPr>
           <w:b/>
-          <w:color w:val="1A4A7A"/>
+          <w:color w:val="1F497D"/>
           <w:sz w:val="22"/>
         </w:rPr>
         <w:t>EDUCATION</w:t>
@@ -710,15 +724,15 @@
       <w:r>
         <w:rPr>
           <w:b/>
-          <w:sz w:val="21"/>
+          <w:sz w:val="20"/>
         </w:rPr>
         <w:t>Financial University under the Government of the Russian Federation, Moscow</w:t>
       </w:r>
       <w:r>
         <w:rPr>
           <w:i/>
-          <w:color w:val="666666"/>
-          <w:sz w:val="19"/>
+          <w:color w:val="555555"/>
+          <w:sz w:val="18"/>
         </w:rPr>
         <w:br/>
         <w:t>2018 – 2022</w:t>
@@ -732,13 +746,13 @@
     <w:p>
       <w:pPr>
         <w:pBdr>
-          <w:bottom w:val="single" w:sz="4" w:color="1A4A7A" w:space="1"/>
+          <w:bottom w:val="single" w:sz="4" w:space="1" w:color="1F497D"/>
         </w:pBdr>
       </w:pPr>
       <w:r>
         <w:rPr>
           <w:b/>
-          <w:color w:val="1A4A7A"/>
+          <w:color w:val="1F497D"/>
           <w:sz w:val="22"/>
         </w:rPr>
         <w:t>PROFESSIONAL DEVELOPMENT</w:t>
@@ -748,15 +762,15 @@
       <w:r>
         <w:rPr>
           <w:b/>
-          <w:sz w:val="21"/>
+          <w:sz w:val="20"/>
         </w:rPr>
         <w:t>Yandex Practicum — Systems Analyst</w:t>
       </w:r>
       <w:r>
         <w:rPr>
           <w:i/>
-          <w:color w:val="666666"/>
-          <w:sz w:val="19"/>
+          <w:color w:val="555555"/>
+          <w:sz w:val="18"/>
         </w:rPr>
         <w:br/>
         <w:t>2025 – 2026</w:t>
@@ -770,13 +784,13 @@
     <w:p>
       <w:pPr>
         <w:pBdr>
-          <w:bottom w:val="single" w:sz="4" w:color="1A4A7A" w:space="1"/>
+          <w:bottom w:val="single" w:sz="4" w:space="1" w:color="1F497D"/>
         </w:pBdr>
       </w:pPr>
       <w:r>
         <w:rPr>
           <w:b/>
-          <w:color w:val="1A4A7A"/>
+          <w:color w:val="1F497D"/>
           <w:sz w:val="22"/>
         </w:rPr>
         <w:t>LANGUAGES</w:t>
@@ -784,7 +798,7 @@
     </w:p>
     <w:p>
       <w:r>
-        <w:t>Russian (native)  |  English (fluent)  |  Spanish (basic)  |  Hebrew (basic)</w:t>
+        <w:t>Russian (native) | English (fluent) | Spanish (basic) | Hebrew (basic)</w:t>
       </w:r>
     </w:p>
     <w:sectPr>
@@ -1160,13 +1174,9 @@
     <w:name w:val="Normal"/>
     <w:qFormat/>
     <w:rsid w:val="00FC693F"/>
-    <w:pPr>
-      <w:spacing w:after="40" w:before="0"/>
-    </w:pPr>
     <w:rPr>
       <w:rFonts w:ascii="Calibri" w:hAnsi="Calibri"/>
-      <w:color w:val="333333"/>
-      <w:sz w:val="21"/>
+      <w:sz w:val="20"/>
     </w:rPr>
   </w:style>
   <w:style w:type="paragraph" w:styleId="Header">

</xml_diff>